<commit_message>
docs: update full team names to Devireddy Nehal, Mohammed Zama, MD Ahmad, Shyam Sundar
</commit_message>
<xml_diff>
--- a/docs/Investment_Portfolio_Risk_Scenario_Analysis_Jury_Report.docx
+++ b/docs/Investment_Portfolio_Risk_Scenario_Analysis_Jury_Report.docx
@@ -105,7 +105,7 @@
               <w:rPr>
                 <w:sz w:val="17"/>
               </w:rPr>
-              <w:t xml:space="preserve"> Nehal Devireddy (Quant &amp; System Architecture)</w:t>
+              <w:t xml:space="preserve"> Devireddy Nehal (Quant &amp; System Architecture)</w:t>
             </w:r>
           </w:p>
         </w:tc>
@@ -172,7 +172,7 @@
               <w:rPr>
                 <w:sz w:val="17"/>
               </w:rPr>
-              <w:t xml:space="preserve"> Zama (Backend/DB), Ahmad (Frontend), Shyam (Visuals)</w:t>
+              <w:t xml:space="preserve"> Mohammed Zama (Backend/DB), MD Ahmad (Frontend), Shyam Sundar (Visuals)</w:t>
             </w:r>
           </w:p>
         </w:tc>
@@ -1827,7 +1827,7 @@
               <w:rPr>
                 <w:sz w:val="16"/>
               </w:rPr>
-              <w:t>Nehal Devireddy</w:t>
+              <w:t>Devireddy Nehal</w:t>
             </w:r>
           </w:p>
         </w:tc>
@@ -1901,7 +1901,7 @@
               <w:rPr>
                 <w:sz w:val="16"/>
               </w:rPr>
-              <w:t>Zama</w:t>
+              <w:t>Mohammed Zama</w:t>
             </w:r>
           </w:p>
         </w:tc>
@@ -1975,7 +1975,7 @@
               <w:rPr>
                 <w:sz w:val="16"/>
               </w:rPr>
-              <w:t>Ahmad</w:t>
+              <w:t>MD Ahmad</w:t>
             </w:r>
           </w:p>
         </w:tc>
@@ -2049,7 +2049,7 @@
               <w:rPr>
                 <w:sz w:val="16"/>
               </w:rPr>
-              <w:t>Shyam</w:t>
+              <w:t>Shyam Sundar</w:t>
             </w:r>
           </w:p>
         </w:tc>

</xml_diff>